<commit_message>
Analysis: add channel traffic-source annex
Co-Authored-By: Claude Opus 5.5 <noreply@anthropic.com>
Claude-Session: https://claude.ai/code/session_01SeyPuGuSuzh4mvvAZeTy1E
</commit_message>
<xml_diff>
--- a/docs/Analisis_Shorts_Club_Animalitos.docx
+++ b/docs/Analisis_Shorts_Club_Animalitos.docx
@@ -1666,6 +1666,54 @@
         <w:t>Sobre las métricas de Shorts en Studio (fuente secundaria; no encontré la página oficial): https://buffer.com/resources/the-creators-guide-to-youtube-shorts-analytics</w:t>
       </w:r>
     </w:p>
+    <w:p>
+      <w:pPr>
+        <w:pStyle w:val="Heading1"/>
+      </w:pPr>
+      <w:r>
+        <w:t>Anexo: fuentes de tráfico del canal (captura de YouTube Studio, 2–29 oct 2026)</w:t>
+      </w:r>
+    </w:p>
+    <w:p>
+      <w:pPr>
+        <w:pStyle w:val="ListBullet"/>
+      </w:pPr>
+      <w:r>
+        <w:t>Feed de Shorts: 2.400 vistas (85,5 %). Búsqueda de YouTube: 234 (8,0 %). Videos sugeridos: 99 (3,4 %). Canales de usuario: 63 (2,2 %). El resto suma menos del 1 %.</w:t>
+      </w:r>
+    </w:p>
+    <w:p>
+      <w:pPr>
+        <w:pStyle w:val="ListBullet"/>
+      </w:pPr>
+      <w:r>
+        <w:t>Total aproximado del canal en el periodo: unas 2.800 vistas.</w:t>
+      </w:r>
+    </w:p>
+    <w:p>
+      <w:pPr>
+        <w:pStyle w:val="ListBullet"/>
+      </w:pPr>
+      <w:r>
+        <w:t>Lectura: casi todo el crecimiento depende de que YouTube muestre el Short en el feed. Si un Short no entra al feed, se queda en 0–2 vistas, que es justo lo que pasa con el grupo B.</w:t>
+      </w:r>
+    </w:p>
+    <w:p>
+      <w:pPr>
+        <w:pStyle w:val="ListBullet"/>
+      </w:pPr>
+      <w:r>
+        <w:t>Cruce con la tabla de la sección 2 (cifras públicas tomadas el 30-oct, así que es una aproximación): los Shorts del grupo A más «Adivina el patrón» suman unas 2.800 vistas; los del grupo B suman unas 53. Es decir, alrededor del 98 % de las vistas del canal vienen de los Shorts con formato Big Motion.</w:t>
+      </w:r>
+    </w:p>
+    <w:p>
+      <w:pPr>
+        <w:pStyle w:val="ListBullet"/>
+      </w:pPr>
+      <w:r>
+        <w:t>Esta captura es de todo el canal y no separa por video, así que todavía no confirma la causa. El siguiente paso es abrir la misma pantalla y la métrica «Mostrado en el feed» para Choco y para Lenny por separado.</w:t>
+      </w:r>
+    </w:p>
     <w:sectPr>
       <w:pgSz w:w="12240" w:h="15840"/>
       <w:pgMar w:top="1440" w:right="1800" w:bottom="1440" w:left="1800" w:header="720" w:footer="720" w:gutter="0"/>

</xml_diff>

<commit_message>
Analysis: add made-for-kids finding from Studio
Co-Authored-By: Claude Opus 5.5 <noreply@anthropic.com>
Claude-Session: https://claude.ai/code/session_01SeyPuGuSuzh4mvvAZeTy1E
</commit_message>
<xml_diff>
--- a/docs/Analisis_Shorts_Club_Animalitos.docx
+++ b/docs/Analisis_Shorts_Club_Animalitos.docx
@@ -1714,6 +1714,70 @@
         <w:t>Esta captura es de todo el canal y no separa por video, así que todavía no confirma la causa. El siguiente paso es abrir la misma pantalla y la métrica «Mostrado en el feed» para Choco y para Lenny por separado.</w:t>
       </w:r>
     </w:p>
+    <w:p>
+      <w:pPr>
+        <w:pStyle w:val="Heading1"/>
+      </w:pPr>
+      <w:r>
+        <w:t>Anexo 2: pista principal — «Hecho para niños» (Studio, Choco, 30-oct-2026)</w:t>
+      </w:r>
+    </w:p>
+    <w:p>
+      <w:pPr>
+        <w:pStyle w:val="ListBullet"/>
+      </w:pPr>
+      <w:r>
+        <w:t>Choco tiene 0 vistas, 0,0 % de reproducción y 0 likes en sus primeros 2 días y 10 horas, y es el último (10 de 10) en la clasificación por vistas.</w:t>
+      </w:r>
+    </w:p>
+    <w:p>
+      <w:pPr>
+        <w:pStyle w:val="ListBullet"/>
+      </w:pPr>
+      <w:r>
+        <w:t>Studio muestra en Choco dos avisos: «Se inhabilitaron los comentarios» y «Se inhabilitaron las notificaciones».</w:t>
+      </w:r>
+    </w:p>
+    <w:p>
+      <w:pPr>
+        <w:pStyle w:val="ListBullet"/>
+      </w:pPr>
+      <w:r>
+        <w:t>Esos dos avisos coinciden con los efectos que YouTube aplica cuando un video se marca como «Hecho para niños»: la ayuda de Google indica que los comentarios se desactivan en ese caso, y las notificaciones a suscriptores también se desactivan (cambio de enero de 2020, tras el acuerdo con la FTC).</w:t>
+      </w:r>
+    </w:p>
+    <w:p>
+      <w:pPr>
+        <w:pStyle w:val="ListBullet"/>
+      </w:pPr>
+      <w:r>
+        <w:t>Hipótesis principal (pendiente de confirmar): el flujo propio sube los videos como «Hecho para niños» y Big Motion no. Según la ayuda de YouTube, esos videos tienden a recomendarse junto a otros videos infantiles, así que salen del circuito normal de recomendaciones, donde sí circulan los de Big Motion.</w:t>
+      </w:r>
+    </w:p>
+    <w:p>
+      <w:pPr>
+        <w:pStyle w:val="ListBullet"/>
+      </w:pPr>
+      <w:r>
+        <w:t>Cómo confirmarlo: abrir Lenny en Studio. Si no muestra esos avisos, la diferencia entre los dos grupos es esta configuración.</w:t>
+      </w:r>
+    </w:p>
+    <w:p>
+      <w:pPr>
+        <w:pStyle w:val="ListBullet"/>
+      </w:pPr>
+      <w:r>
+        <w:t>Advertencia: marcar un video como «Hecho para niños» no es opcional cuando el contenido está dirigido a niños; es una obligación legal (ley COPPA en EE. UU.). Si los cuentos son para niños en edad preescolar, lo que podría estar mal es la configuración de los de Big Motion. Conviene revisarlo antes de cambiar nada.</w:t>
+      </w:r>
+    </w:p>
+    <w:p>
+      <w:pPr>
+        <w:pStyle w:val="ListBullet"/>
+      </w:pPr>
+      <w:r>
+        <w:t>Fuentes: https://support.google.com/youtube/answer/9706180 , https://support.google.com/youtube/answer/9528076 , https://tubefilter.com/2020/01/07/youtube-disables-more-product-features-kid-oriented-content/</w:t>
+      </w:r>
+    </w:p>
     <w:sectPr>
       <w:pgSz w:w="12240" w:h="15840"/>
       <w:pgMar w:top="1440" w:right="1800" w:bottom="1440" w:left="1800" w:header="720" w:footer="720" w:gutter="0"/>

</xml_diff>

<commit_message>
Analysis: add Lenny vs Choco Studio comparison
Co-Authored-By: Claude Opus 5.5 <noreply@anthropic.com>
Claude-Session: https://claude.ai/code/session_01SeyPuGuSuzh4mvvAZeTy1E
</commit_message>
<xml_diff>
--- a/docs/Analisis_Shorts_Club_Animalitos.docx
+++ b/docs/Analisis_Shorts_Club_Animalitos.docx
@@ -1778,6 +1778,62 @@
         <w:t>Fuentes: https://support.google.com/youtube/answer/9706180 , https://support.google.com/youtube/answer/9528076 , https://tubefilter.com/2020/01/07/youtube-disables-more-product-features-kid-oriented-content/</w:t>
       </w:r>
     </w:p>
+    <w:p>
+      <w:pPr>
+        <w:pStyle w:val="Heading1"/>
+      </w:pPr>
+      <w:r>
+        <w:t>Anexo 3: comparación Lenny (Big Motion) frente a Choco (flujo propio) en Studio</w:t>
+      </w:r>
+    </w:p>
+    <w:p>
+      <w:pPr>
+        <w:pStyle w:val="ListBullet"/>
+      </w:pPr>
+      <w:r>
+        <w:t>Lenny (3 días y 11 h): sin avisos, comentarios activos (tiene 1 comentario), 992 vistas, 29,4 % de reproducción promedio, 15 likes, puesto 2 de 10.</w:t>
+      </w:r>
+    </w:p>
+    <w:p>
+      <w:pPr>
+        <w:pStyle w:val="ListBullet"/>
+      </w:pPr>
+      <w:r>
+        <w:t>Choco (2 días y 10 h): avisos «Se inhabilitaron los comentarios» y «Se inhabilitaron las notificaciones», 0 vistas, 0,0 %, 0 likes, puesto 10 de 10.</w:t>
+      </w:r>
+    </w:p>
+    <w:p>
+      <w:pPr>
+        <w:pStyle w:val="ListBullet"/>
+      </w:pPr>
+      <w:r>
+        <w:t>Conclusión: la única diferencia de configuración visible entre los dos grupos es la que corresponde a «Hecho para niños». Es la explicación más probable de las vistas en cero; el estilo, la narración y la etiqueta de IA pasan a ser secundarios.</w:t>
+      </w:r>
+    </w:p>
+    <w:p>
+      <w:pPr>
+        <w:pStyle w:val="ListBullet"/>
+      </w:pPr>
+      <w:r>
+        <w:t>Falta confirmarlo en el campo «Audiencia» de cada video (editar → Audiencia).</w:t>
+      </w:r>
+    </w:p>
+    <w:p>
+      <w:pPr>
+        <w:pStyle w:val="ListBullet"/>
+      </w:pPr>
+      <w:r>
+        <w:t>Dato aparte: el 29,4 % de reproducción promedio de Lenny equivale a unos 16 segundos de 55. La mayoría no ve el cuento completo, así que hay margen para mejorar el gancho inicial.</w:t>
+      </w:r>
+    </w:p>
+    <w:p>
+      <w:pPr>
+        <w:pStyle w:val="ListBullet"/>
+      </w:pPr>
+      <w:r>
+        <w:t>Decisión pendiente: si los cuentos están dirigidos a niños, la ley COPPA obliga a marcarlos como «Hecho para niños». En ese caso habría que corregir los de Big Motion, no desmarcar los propios. Quitar la marca solo para ganar vistas expone el canal a que YouTube la cambie por su cuenta o a sanciones.</w:t>
+      </w:r>
+    </w:p>
     <w:sectPr>
       <w:pgSz w:w="12240" w:h="15840"/>
       <w:pgMar w:top="1440" w:right="1800" w:bottom="1440" w:left="1800" w:header="720" w:footer="720" w:gutter="0"/>

</xml_diff>

<commit_message>
Analysis: confirm audience setting difference
Co-Authored-By: Claude Opus 5.5 <noreply@anthropic.com>
Claude-Session: https://claude.ai/code/session_01SeyPuGuSuzh4mvvAZeTy1E
</commit_message>
<xml_diff>
--- a/docs/Analisis_Shorts_Club_Animalitos.docx
+++ b/docs/Analisis_Shorts_Club_Animalitos.docx
@@ -1834,6 +1834,54 @@
         <w:t>Decisión pendiente: si los cuentos están dirigidos a niños, la ley COPPA obliga a marcarlos como «Hecho para niños». En ese caso habría que corregir los de Big Motion, no desmarcar los propios. Quitar la marca solo para ganar vistas expone el canal a que YouTube la cambie por su cuenta o a sanciones.</w:t>
       </w:r>
     </w:p>
+    <w:p>
+      <w:pPr>
+        <w:pStyle w:val="Heading1"/>
+      </w:pPr>
+      <w:r>
+        <w:t>Anexo 4: confirmado — configuración de audiencia (Studio, 30-oct-2026)</w:t>
+      </w:r>
+    </w:p>
+    <w:p>
+      <w:pPr>
+        <w:pStyle w:val="ListBullet"/>
+      </w:pPr>
+      <w:r>
+        <w:t>Lenny (Big Motion): Público = «No es contenido creado para niños».</w:t>
+      </w:r>
+    </w:p>
+    <w:p>
+      <w:pPr>
+        <w:pStyle w:val="ListBullet"/>
+      </w:pPr>
+      <w:r>
+        <w:t>Choco (flujo propio): Público = «Sí, es contenido creado para niños». Además, «Video relacionado» aparece desactivado.</w:t>
+      </w:r>
+    </w:p>
+    <w:p>
+      <w:pPr>
+        <w:pStyle w:val="ListBullet"/>
+      </w:pPr>
+      <w:r>
+        <w:t>Causa confirmada de la diferencia de vistas entre Lenny y Choco: la configuración de audiencia. Falta comprobarlo en el resto de los Shorts de cada grupo, pero el patrón de los avisos apunta a lo mismo.</w:t>
+      </w:r>
+    </w:p>
+    <w:p>
+      <w:pPr>
+        <w:pStyle w:val="ListBullet"/>
+      </w:pPr>
+      <w:r>
+        <w:t>Decisión: la configuración debe reflejar a quién va dirigido el contenido, no lo que da más vistas. Los cuentos animados de animalitos con lecciones para preescolares encajan con lo que YouTube describe como contenido dirigido a niños. Si es así, los de Big Motion estarían mal marcados y habría que corregirlos.</w:t>
+      </w:r>
+    </w:p>
+    <w:p>
+      <w:pPr>
+        <w:pStyle w:val="ListBullet"/>
+      </w:pPr>
+      <w:r>
+        <w:t>Acción sugerida: definir una política única para el canal (Studio → Configuración → Canal → Configuración avanzada → Audiencia) y verificar que Big Motion y el flujo propio la respeten.</w:t>
+      </w:r>
+    </w:p>
     <w:sectPr>
       <w:pgSz w:w="12240" w:h="15840"/>
       <w:pgMar w:top="1440" w:right="1800" w:bottom="1440" w:left="1800" w:header="720" w:footer="720" w:gutter="0"/>

</xml_diff>

<commit_message>
Analysis: add parent-vs-child audience annex
Co-Authored-By: Claude Opus 5.5 <noreply@anthropic.com>
Claude-Session: https://claude.ai/code/session_01SeyPuGuSuzh4mvvAZeTy1E
</commit_message>
<xml_diff>
--- a/docs/Analisis_Shorts_Club_Animalitos.docx
+++ b/docs/Analisis_Shorts_Club_Animalitos.docx
@@ -1882,6 +1882,70 @@
         <w:t>Acción sugerida: definir una política única para el canal (Studio → Configuración → Canal → Configuración avanzada → Audiencia) y verificar que Big Motion y el flujo propio la respeten.</w:t>
       </w:r>
     </w:p>
+    <w:p>
+      <w:pPr>
+        <w:pStyle w:val="Heading1"/>
+      </w:pPr>
+      <w:r>
+        <w:t>Anexo 5: ¿son videos para adultos si quien elige el cuento es el papá?</w:t>
+      </w:r>
+    </w:p>
+    <w:p>
+      <w:pPr>
+        <w:pStyle w:val="ListBullet"/>
+      </w:pPr>
+      <w:r>
+        <w:t>Criterio de YouTube: decide para quién está hecho el video y cómo está presentado, no quién lo elige. Factores oficiales: tema («contenido educativo para preescolares»), personajes animados, lenguaje pensado para que lo entiendan niños, «canciones, cuentos o poemas para niños», actividades de educación temprana y a quién va dirigida la metadata.</w:t>
+      </w:r>
+    </w:p>
+    <w:p>
+      <w:pPr>
+        <w:pStyle w:val="ListBullet"/>
+      </w:pPr>
+      <w:r>
+        <w:t>Los cuentos actuales cumplen casi todos esos factores, y la narración le habla directamente al niño («¿Tú también masticas despacio…?»). Con el formato actual, lo más defendible es «Sí, es contenido creado para niños».</w:t>
+      </w:r>
+    </w:p>
+    <w:p>
+      <w:pPr>
+        <w:pStyle w:val="ListBullet"/>
+      </w:pPr>
+      <w:r>
+        <w:t>Matiz de la FTC: los colores llamativos o los personajes animados no convierten automáticamente un video en contenido infantil, y que algunos niños lo vean tampoco. Pero la FTC evalúa el conjunto del video: el tema, lo visual, el idioma y la edad real de la audiencia.</w:t>
+      </w:r>
+    </w:p>
+    <w:p>
+      <w:pPr>
+        <w:pStyle w:val="ListBullet"/>
+      </w:pPr>
+      <w:r>
+        <w:t>YouTube da como ejemplo de contenido NO infantil «un vlog familiar que les cuenta a otros padres sobre la visita a un parque»: es contenido sobre niños, hablado para adultos.</w:t>
+      </w:r>
+    </w:p>
+    <w:p>
+      <w:pPr>
+        <w:pStyle w:val="ListBullet"/>
+      </w:pPr>
+      <w:r>
+        <w:t>Opción legítima: crear un segundo formato realmente dirigido a padres. Una persona adulta (o una voz adulta) le habla al papá: «¿Tu hijo come muy rápido? Así lo puedes trabajar en casa», con consejos y, como apoyo, un fragmento corto del cuento. Ese video sí podría marcarse «No es contenido creado para niños». Cambiar solo el título o la descripción no basta.</w:t>
+      </w:r>
+    </w:p>
+    <w:p>
+      <w:pPr>
+        <w:pStyle w:val="ListBullet"/>
+      </w:pPr>
+      <w:r>
+        <w:t>Esto es orientación basada en las guías públicas de YouTube y la FTC, no una opinión legal.</w:t>
+      </w:r>
+    </w:p>
+    <w:p>
+      <w:pPr>
+        <w:pStyle w:val="ListBullet"/>
+      </w:pPr>
+      <w:r>
+        <w:t>Fuentes: https://support.google.com/youtube/answer/9528076 y https://www.ftc.gov/business-guidance/blog/2019/11/youtube-channel-owners-your-content-directed-children</w:t>
+      </w:r>
+    </w:p>
     <w:sectPr>
       <w:pgSz w:w="12240" w:h="15840"/>
       <w:pgMar w:top="1440" w:right="1800" w:bottom="1440" w:left="1800" w:header="720" w:footer="720" w:gutter="0"/>

</xml_diff>

<commit_message>
Analysis: add YouTube Kids strategy annex
Co-Authored-By: Claude Opus 5.5 <noreply@anthropic.com>
Claude-Session: https://claude.ai/code/session_01SeyPuGuSuzh4mvvAZeTy1E
</commit_message>
<xml_diff>
--- a/docs/Analisis_Shorts_Club_Animalitos.docx
+++ b/docs/Analisis_Shorts_Club_Animalitos.docx
@@ -1946,6 +1946,70 @@
         <w:t>Fuentes: https://support.google.com/youtube/answer/9528076 y https://www.ftc.gov/business-guidance/blog/2019/11/youtube-channel-owners-your-content-directed-children</w:t>
       </w:r>
     </w:p>
+    <w:p>
+      <w:pPr>
+        <w:pStyle w:val="Heading1"/>
+      </w:pPr>
+      <w:r>
+        <w:t>Anexo 6: cómo llegar a YouTube Kids</w:t>
+      </w:r>
+    </w:p>
+    <w:p>
+      <w:pPr>
+        <w:pStyle w:val="ListBullet"/>
+      </w:pPr>
+      <w:r>
+        <w:t>No hay un formulario ni una solicitud para «pasar» un canal a YouTube Kids. Los videos se suben al YouTube normal, y YouTube decide cuáles entran a la app con filtros automáticos, revisión humana (sobre todo en la pantalla de inicio), comentarios de los padres y sus «principios de calidad».</w:t>
+      </w:r>
+    </w:p>
+    <w:p>
+      <w:pPr>
+        <w:pStyle w:val="ListBullet"/>
+      </w:pPr>
+      <w:r>
+        <w:t>Las fuentes no coinciden en si la marca «Hecho para niños» es requisito para entrar a la app. Lo coherente es marcar los videos así, pero no garantiza la entrada.</w:t>
+      </w:r>
+    </w:p>
+    <w:p>
+      <w:pPr>
+        <w:pStyle w:val="ListBullet"/>
+      </w:pPr>
+      <w:r>
+        <w:t>Según fuentes secundarias (Android Authority, Qustodio), la app YouTube Kids no tiene sección de Shorts. Por tanto, la estrategia para Kids debe basarse en videos normales: horizontales y más largos (por ejemplo, recopilaciones de 5–10 minutos con varios cuentos), no en Shorts.</w:t>
+      </w:r>
+    </w:p>
+    <w:p>
+      <w:pPr>
+        <w:pStyle w:val="ListBullet"/>
+      </w:pPr>
+      <w:r>
+        <w:t>YouTube retira de YouTube Kids los videos con contenido de marca declarado y no admite contenido demasiado comercial o promocional. No mencionar ni promocionar la tienda Cestoria dentro de estos videos.</w:t>
+      </w:r>
+    </w:p>
+    <w:p>
+      <w:pPr>
+        <w:pStyle w:val="ListBullet"/>
+      </w:pPr>
+      <w:r>
+        <w:t>Pasos: 1) audiencia del canal → Hecho para niños (Studio → Configuración → Canal → Configuración avanzada); 2) subir recopilaciones horizontales por tema; 3) organizarlas en listas de reproducción por tema («Hábitos», «Emociones», «Seguridad»); 4) cuidar la calidad: cuentos con valor educativo, sin «clickbait» y sin promociones; 5) comprobar periódicamente, con un perfil infantil en la app, si aparecen.</w:t>
+      </w:r>
+    </w:p>
+    <w:p>
+      <w:pPr>
+        <w:pStyle w:val="ListBullet"/>
+      </w:pPr>
+      <w:r>
+        <w:t>No hay garantía de entrada ni plazo conocido.</w:t>
+      </w:r>
+    </w:p>
+    <w:p>
+      <w:pPr>
+        <w:pStyle w:val="ListBullet"/>
+      </w:pPr>
+      <w:r>
+        <w:t>Fuentes: https://support.google.com/youtubekids/answer/6172307 ; https://support.google.com/youtubekids/answer/6130541 ; https://www.androidauthority.com/youtube-parental-controls-shorts-timer-3632428 ; https://www.qustodio.com/en/blog/is-youtube-shorts-safe-for-kids/</w:t>
+      </w:r>
+    </w:p>
     <w:sectPr>
       <w:pgSz w:w="12240" w:h="15840"/>
       <w:pgMar w:top="1440" w:right="1800" w:bottom="1440" w:left="1800" w:header="720" w:footer="720" w:gutter="0"/>

</xml_diff>